<commit_message>
Ajusta el flujo alternativo de conversion del ECUD a categoria inexistente (DATA-001)
</commit_message>
<xml_diff>
--- a/TI.1.1 PAO202651_SOAP_JAVA_SINBDD_NRC36883_GR09/01. UML/0.2 ECUD/ECUD_CONVERSION_UNIDADES_SEGURIDAD_COMPLETA (1).docx
+++ b/TI.1.1 PAO202651_SOAP_JAVA_SINBDD_NRC36883_GR09/01. UML/0.2 ECUD/ECUD_CONVERSION_UNIDADES_SEGURIDAD_COMPLETA (1).docx
@@ -3135,7 +3135,7 @@
       <w:r>
         <w:fldChar w:fldCharType="separate"/>
       </w:r>
-      <w:hyperlink w:anchor="_Toc243458904" w:history="1">
+      <w:hyperlink w:anchor="_Toc243474498" w:history="1">
         <w:r>
           <w:rPr>
             <w:rStyle w:val="Hipervnculo"/>
@@ -3162,7 +3162,7 @@
             <w:noProof/>
             <w:webHidden/>
           </w:rPr>
-          <w:instrText xml:space="preserve"> PAGEREF _Toc243458904 \h </w:instrText>
+          <w:instrText xml:space="preserve"> PAGEREF _Toc243474498 \h </w:instrText>
         </w:r>
         <w:r>
           <w:rPr>
@@ -3210,7 +3210,7 @@
           <w14:ligatures w14:val="standardContextual"/>
         </w:rPr>
       </w:pPr>
-      <w:hyperlink w:anchor="_Toc243458905" w:history="1">
+      <w:hyperlink w:anchor="_Toc243474499" w:history="1">
         <w:r>
           <w:rPr>
             <w:rStyle w:val="Hipervnculo"/>
@@ -3237,7 +3237,7 @@
             <w:noProof/>
             <w:webHidden/>
           </w:rPr>
-          <w:instrText xml:space="preserve"> PAGEREF _Toc243458905 \h </w:instrText>
+          <w:instrText xml:space="preserve"> PAGEREF _Toc243474499 \h </w:instrText>
         </w:r>
         <w:r>
           <w:rPr>
@@ -3285,7 +3285,7 @@
           <w14:ligatures w14:val="standardContextual"/>
         </w:rPr>
       </w:pPr>
-      <w:hyperlink w:anchor="_Toc243458906" w:history="1">
+      <w:hyperlink w:anchor="_Toc243474500" w:history="1">
         <w:r>
           <w:rPr>
             <w:rStyle w:val="Hipervnculo"/>
@@ -3312,7 +3312,7 @@
             <w:noProof/>
             <w:webHidden/>
           </w:rPr>
-          <w:instrText xml:space="preserve"> PAGEREF _Toc243458906 \h </w:instrText>
+          <w:instrText xml:space="preserve"> PAGEREF _Toc243474500 \h </w:instrText>
         </w:r>
         <w:r>
           <w:rPr>
@@ -3360,7 +3360,7 @@
           <w14:ligatures w14:val="standardContextual"/>
         </w:rPr>
       </w:pPr>
-      <w:hyperlink w:anchor="_Toc243458907" w:history="1">
+      <w:hyperlink w:anchor="_Toc243474501" w:history="1">
         <w:r>
           <w:rPr>
             <w:rStyle w:val="Hipervnculo"/>
@@ -3387,7 +3387,7 @@
             <w:noProof/>
             <w:webHidden/>
           </w:rPr>
-          <w:instrText xml:space="preserve"> PAGEREF _Toc243458907 \h </w:instrText>
+          <w:instrText xml:space="preserve"> PAGEREF _Toc243474501 \h </w:instrText>
         </w:r>
         <w:r>
           <w:rPr>
@@ -3435,7 +3435,7 @@
           <w14:ligatures w14:val="standardContextual"/>
         </w:rPr>
       </w:pPr>
-      <w:hyperlink w:anchor="_Toc243458908" w:history="1">
+      <w:hyperlink w:anchor="_Toc243474502" w:history="1">
         <w:r>
           <w:rPr>
             <w:rStyle w:val="Hipervnculo"/>
@@ -3462,7 +3462,7 @@
             <w:noProof/>
             <w:webHidden/>
           </w:rPr>
-          <w:instrText xml:space="preserve"> PAGEREF _Toc243458908 \h </w:instrText>
+          <w:instrText xml:space="preserve"> PAGEREF _Toc243474502 \h </w:instrText>
         </w:r>
         <w:r>
           <w:rPr>
@@ -3510,7 +3510,7 @@
           <w14:ligatures w14:val="standardContextual"/>
         </w:rPr>
       </w:pPr>
-      <w:hyperlink w:anchor="_Toc243458909" w:history="1">
+      <w:hyperlink w:anchor="_Toc243474503" w:history="1">
         <w:r>
           <w:rPr>
             <w:rStyle w:val="Hipervnculo"/>
@@ -3537,7 +3537,7 @@
             <w:noProof/>
             <w:webHidden/>
           </w:rPr>
-          <w:instrText xml:space="preserve"> PAGEREF _Toc243458909 \h </w:instrText>
+          <w:instrText xml:space="preserve"> PAGEREF _Toc243474503 \h </w:instrText>
         </w:r>
         <w:r>
           <w:rPr>
@@ -3585,7 +3585,7 @@
           <w14:ligatures w14:val="standardContextual"/>
         </w:rPr>
       </w:pPr>
-      <w:hyperlink w:anchor="_Toc243458910" w:history="1">
+      <w:hyperlink w:anchor="_Toc243474504" w:history="1">
         <w:r>
           <w:rPr>
             <w:rStyle w:val="Hipervnculo"/>
@@ -3612,7 +3612,7 @@
             <w:noProof/>
             <w:webHidden/>
           </w:rPr>
-          <w:instrText xml:space="preserve"> PAGEREF _Toc243458910 \h </w:instrText>
+          <w:instrText xml:space="preserve"> PAGEREF _Toc243474504 \h </w:instrText>
         </w:r>
         <w:r>
           <w:rPr>
@@ -3660,7 +3660,7 @@
           <w14:ligatures w14:val="standardContextual"/>
         </w:rPr>
       </w:pPr>
-      <w:hyperlink w:anchor="_Toc243458911" w:history="1">
+      <w:hyperlink w:anchor="_Toc243474505" w:history="1">
         <w:r>
           <w:rPr>
             <w:rStyle w:val="Hipervnculo"/>
@@ -3687,7 +3687,7 @@
             <w:noProof/>
             <w:webHidden/>
           </w:rPr>
-          <w:instrText xml:space="preserve"> PAGEREF _Toc243458911 \h </w:instrText>
+          <w:instrText xml:space="preserve"> PAGEREF _Toc243474505 \h </w:instrText>
         </w:r>
         <w:r>
           <w:rPr>
@@ -3735,7 +3735,7 @@
           <w14:ligatures w14:val="standardContextual"/>
         </w:rPr>
       </w:pPr>
-      <w:hyperlink w:anchor="_Toc243458912" w:history="1">
+      <w:hyperlink w:anchor="_Toc243474506" w:history="1">
         <w:r>
           <w:rPr>
             <w:rStyle w:val="Hipervnculo"/>
@@ -3762,7 +3762,7 @@
             <w:noProof/>
             <w:webHidden/>
           </w:rPr>
-          <w:instrText xml:space="preserve"> PAGEREF _Toc243458912 \h </w:instrText>
+          <w:instrText xml:space="preserve"> PAGEREF _Toc243474506 \h </w:instrText>
         </w:r>
         <w:r>
           <w:rPr>
@@ -3810,7 +3810,7 @@
           <w14:ligatures w14:val="standardContextual"/>
         </w:rPr>
       </w:pPr>
-      <w:hyperlink w:anchor="_Toc243458913" w:history="1">
+      <w:hyperlink w:anchor="_Toc243474507" w:history="1">
         <w:r>
           <w:rPr>
             <w:rStyle w:val="Hipervnculo"/>
@@ -3837,7 +3837,7 @@
             <w:noProof/>
             <w:webHidden/>
           </w:rPr>
-          <w:instrText xml:space="preserve"> PAGEREF _Toc243458913 \h </w:instrText>
+          <w:instrText xml:space="preserve"> PAGEREF _Toc243474507 \h </w:instrText>
         </w:r>
         <w:r>
           <w:rPr>
@@ -3885,7 +3885,7 @@
           <w14:ligatures w14:val="standardContextual"/>
         </w:rPr>
       </w:pPr>
-      <w:hyperlink w:anchor="_Toc243458914" w:history="1">
+      <w:hyperlink w:anchor="_Toc243474508" w:history="1">
         <w:r>
           <w:rPr>
             <w:rStyle w:val="Hipervnculo"/>
@@ -3912,7 +3912,7 @@
             <w:noProof/>
             <w:webHidden/>
           </w:rPr>
-          <w:instrText xml:space="preserve"> PAGEREF _Toc243458914 \h </w:instrText>
+          <w:instrText xml:space="preserve"> PAGEREF _Toc243474508 \h </w:instrText>
         </w:r>
         <w:r>
           <w:rPr>
@@ -3960,7 +3960,7 @@
           <w14:ligatures w14:val="standardContextual"/>
         </w:rPr>
       </w:pPr>
-      <w:hyperlink w:anchor="_Toc243458915" w:history="1">
+      <w:hyperlink w:anchor="_Toc243474509" w:history="1">
         <w:r>
           <w:rPr>
             <w:rStyle w:val="Hipervnculo"/>
@@ -3987,7 +3987,7 @@
             <w:noProof/>
             <w:webHidden/>
           </w:rPr>
-          <w:instrText xml:space="preserve"> PAGEREF _Toc243458915 \h </w:instrText>
+          <w:instrText xml:space="preserve"> PAGEREF _Toc243474509 \h </w:instrText>
         </w:r>
         <w:r>
           <w:rPr>
@@ -4035,7 +4035,7 @@
           <w14:ligatures w14:val="standardContextual"/>
         </w:rPr>
       </w:pPr>
-      <w:hyperlink w:anchor="_Toc243458916" w:history="1">
+      <w:hyperlink w:anchor="_Toc243474510" w:history="1">
         <w:r>
           <w:rPr>
             <w:rStyle w:val="Hipervnculo"/>
@@ -4062,7 +4062,7 @@
             <w:noProof/>
             <w:webHidden/>
           </w:rPr>
-          <w:instrText xml:space="preserve"> PAGEREF _Toc243458916 \h </w:instrText>
+          <w:instrText xml:space="preserve"> PAGEREF _Toc243474510 \h </w:instrText>
         </w:r>
         <w:r>
           <w:rPr>
@@ -4110,7 +4110,7 @@
           <w14:ligatures w14:val="standardContextual"/>
         </w:rPr>
       </w:pPr>
-      <w:hyperlink w:anchor="_Toc243458917" w:history="1">
+      <w:hyperlink w:anchor="_Toc243474511" w:history="1">
         <w:r>
           <w:rPr>
             <w:rStyle w:val="Hipervnculo"/>
@@ -4137,7 +4137,7 @@
             <w:noProof/>
             <w:webHidden/>
           </w:rPr>
-          <w:instrText xml:space="preserve"> PAGEREF _Toc243458917 \h </w:instrText>
+          <w:instrText xml:space="preserve"> PAGEREF _Toc243474511 \h </w:instrText>
         </w:r>
         <w:r>
           <w:rPr>
@@ -4185,7 +4185,7 @@
           <w14:ligatures w14:val="standardContextual"/>
         </w:rPr>
       </w:pPr>
-      <w:hyperlink w:anchor="_Toc243458918" w:history="1">
+      <w:hyperlink w:anchor="_Toc243474512" w:history="1">
         <w:r>
           <w:rPr>
             <w:rStyle w:val="Hipervnculo"/>
@@ -4212,7 +4212,7 @@
             <w:noProof/>
             <w:webHidden/>
           </w:rPr>
-          <w:instrText xml:space="preserve"> PAGEREF _Toc243458918 \h </w:instrText>
+          <w:instrText xml:space="preserve"> PAGEREF _Toc243474512 \h </w:instrText>
         </w:r>
         <w:r>
           <w:rPr>
@@ -4260,7 +4260,7 @@
           <w14:ligatures w14:val="standardContextual"/>
         </w:rPr>
       </w:pPr>
-      <w:hyperlink w:anchor="_Toc243458919" w:history="1">
+      <w:hyperlink w:anchor="_Toc243474513" w:history="1">
         <w:r>
           <w:rPr>
             <w:rStyle w:val="Hipervnculo"/>
@@ -4287,7 +4287,7 @@
             <w:noProof/>
             <w:webHidden/>
           </w:rPr>
-          <w:instrText xml:space="preserve"> PAGEREF _Toc243458919 \h </w:instrText>
+          <w:instrText xml:space="preserve"> PAGEREF _Toc243474513 \h </w:instrText>
         </w:r>
         <w:r>
           <w:rPr>
@@ -4335,7 +4335,7 @@
           <w14:ligatures w14:val="standardContextual"/>
         </w:rPr>
       </w:pPr>
-      <w:hyperlink w:anchor="_Toc243458920" w:history="1">
+      <w:hyperlink w:anchor="_Toc243474514" w:history="1">
         <w:r>
           <w:rPr>
             <w:rStyle w:val="Hipervnculo"/>
@@ -4362,7 +4362,7 @@
             <w:noProof/>
             <w:webHidden/>
           </w:rPr>
-          <w:instrText xml:space="preserve"> PAGEREF _Toc243458920 \h </w:instrText>
+          <w:instrText xml:space="preserve"> PAGEREF _Toc243474514 \h </w:instrText>
         </w:r>
         <w:r>
           <w:rPr>
@@ -4410,7 +4410,7 @@
           <w14:ligatures w14:val="standardContextual"/>
         </w:rPr>
       </w:pPr>
-      <w:hyperlink w:anchor="_Toc243458921" w:history="1">
+      <w:hyperlink w:anchor="_Toc243474515" w:history="1">
         <w:r>
           <w:rPr>
             <w:rStyle w:val="Hipervnculo"/>
@@ -4437,7 +4437,7 @@
             <w:noProof/>
             <w:webHidden/>
           </w:rPr>
-          <w:instrText xml:space="preserve"> PAGEREF _Toc243458921 \h </w:instrText>
+          <w:instrText xml:space="preserve"> PAGEREF _Toc243474515 \h </w:instrText>
         </w:r>
         <w:r>
           <w:rPr>
@@ -4485,7 +4485,7 @@
           <w14:ligatures w14:val="standardContextual"/>
         </w:rPr>
       </w:pPr>
-      <w:hyperlink w:anchor="_Toc243458922" w:history="1">
+      <w:hyperlink w:anchor="_Toc243474516" w:history="1">
         <w:r>
           <w:rPr>
             <w:rStyle w:val="Hipervnculo"/>
@@ -4512,7 +4512,7 @@
             <w:noProof/>
             <w:webHidden/>
           </w:rPr>
-          <w:instrText xml:space="preserve"> PAGEREF _Toc243458922 \h </w:instrText>
+          <w:instrText xml:space="preserve"> PAGEREF _Toc243474516 \h </w:instrText>
         </w:r>
         <w:r>
           <w:rPr>
@@ -4560,7 +4560,7 @@
           <w14:ligatures w14:val="standardContextual"/>
         </w:rPr>
       </w:pPr>
-      <w:hyperlink w:anchor="_Toc243458923" w:history="1">
+      <w:hyperlink w:anchor="_Toc243474517" w:history="1">
         <w:r>
           <w:rPr>
             <w:rStyle w:val="Hipervnculo"/>
@@ -4587,7 +4587,7 @@
             <w:noProof/>
             <w:webHidden/>
           </w:rPr>
-          <w:instrText xml:space="preserve"> PAGEREF _Toc243458923 \h </w:instrText>
+          <w:instrText xml:space="preserve"> PAGEREF _Toc243474517 \h </w:instrText>
         </w:r>
         <w:r>
           <w:rPr>
@@ -4635,7 +4635,7 @@
           <w14:ligatures w14:val="standardContextual"/>
         </w:rPr>
       </w:pPr>
-      <w:hyperlink w:anchor="_Toc243458924" w:history="1">
+      <w:hyperlink w:anchor="_Toc243474518" w:history="1">
         <w:r>
           <w:rPr>
             <w:rStyle w:val="Hipervnculo"/>
@@ -4662,7 +4662,7 @@
             <w:noProof/>
             <w:webHidden/>
           </w:rPr>
-          <w:instrText xml:space="preserve"> PAGEREF _Toc243458924 \h </w:instrText>
+          <w:instrText xml:space="preserve"> PAGEREF _Toc243474518 \h </w:instrText>
         </w:r>
         <w:r>
           <w:rPr>
@@ -4710,7 +4710,7 @@
           <w14:ligatures w14:val="standardContextual"/>
         </w:rPr>
       </w:pPr>
-      <w:hyperlink w:anchor="_Toc243458925" w:history="1">
+      <w:hyperlink w:anchor="_Toc243474519" w:history="1">
         <w:r>
           <w:rPr>
             <w:rStyle w:val="Hipervnculo"/>
@@ -4737,7 +4737,7 @@
             <w:noProof/>
             <w:webHidden/>
           </w:rPr>
-          <w:instrText xml:space="preserve"> PAGEREF _Toc243458925 \h </w:instrText>
+          <w:instrText xml:space="preserve"> PAGEREF _Toc243474519 \h </w:instrText>
         </w:r>
         <w:r>
           <w:rPr>
@@ -4785,7 +4785,7 @@
           <w14:ligatures w14:val="standardContextual"/>
         </w:rPr>
       </w:pPr>
-      <w:hyperlink w:anchor="_Toc243458926" w:history="1">
+      <w:hyperlink w:anchor="_Toc243474520" w:history="1">
         <w:r>
           <w:rPr>
             <w:rStyle w:val="Hipervnculo"/>
@@ -4812,7 +4812,7 @@
             <w:noProof/>
             <w:webHidden/>
           </w:rPr>
-          <w:instrText xml:space="preserve"> PAGEREF _Toc243458926 \h </w:instrText>
+          <w:instrText xml:space="preserve"> PAGEREF _Toc243474520 \h </w:instrText>
         </w:r>
         <w:r>
           <w:rPr>
@@ -4860,7 +4860,7 @@
           <w14:ligatures w14:val="standardContextual"/>
         </w:rPr>
       </w:pPr>
-      <w:hyperlink w:anchor="_Toc243458927" w:history="1">
+      <w:hyperlink w:anchor="_Toc243474521" w:history="1">
         <w:r>
           <w:rPr>
             <w:rStyle w:val="Hipervnculo"/>
@@ -4887,7 +4887,7 @@
             <w:noProof/>
             <w:webHidden/>
           </w:rPr>
-          <w:instrText xml:space="preserve"> PAGEREF _Toc243458927 \h </w:instrText>
+          <w:instrText xml:space="preserve"> PAGEREF _Toc243474521 \h </w:instrText>
         </w:r>
         <w:r>
           <w:rPr>
@@ -4935,7 +4935,7 @@
           <w14:ligatures w14:val="standardContextual"/>
         </w:rPr>
       </w:pPr>
-      <w:hyperlink w:anchor="_Toc243458928" w:history="1">
+      <w:hyperlink w:anchor="_Toc243474522" w:history="1">
         <w:r>
           <w:rPr>
             <w:rStyle w:val="Hipervnculo"/>
@@ -4962,7 +4962,7 @@
             <w:noProof/>
             <w:webHidden/>
           </w:rPr>
-          <w:instrText xml:space="preserve"> PAGEREF _Toc243458928 \h </w:instrText>
+          <w:instrText xml:space="preserve"> PAGEREF _Toc243474522 \h </w:instrText>
         </w:r>
         <w:r>
           <w:rPr>
@@ -5050,7 +5050,7 @@
       <w:r>
         <w:fldChar w:fldCharType="separate"/>
       </w:r>
-      <w:hyperlink w:anchor="_Toc243458929" w:history="1">
+      <w:hyperlink w:anchor="_Toc243474523" w:history="1">
         <w:r>
           <w:rPr>
             <w:rStyle w:val="Hipervnculo"/>
@@ -5077,7 +5077,7 @@
             <w:noProof/>
             <w:webHidden/>
           </w:rPr>
-          <w:instrText xml:space="preserve"> PAGEREF _Toc243458929 \h </w:instrText>
+          <w:instrText xml:space="preserve"> PAGEREF _Toc243474523 \h </w:instrText>
         </w:r>
         <w:r>
           <w:rPr>
@@ -5156,7 +5156,7 @@
       <w:r>
         <w:fldChar w:fldCharType="separate"/>
       </w:r>
-      <w:hyperlink w:anchor="_Toc243458930" w:history="1">
+      <w:hyperlink w:anchor="_Toc243474524" w:history="1">
         <w:r>
           <w:rPr>
             <w:rStyle w:val="Hipervnculo"/>
@@ -5183,7 +5183,7 @@
             <w:noProof/>
             <w:webHidden/>
           </w:rPr>
-          <w:instrText xml:space="preserve"> PAGEREF _Toc243458930 \h </w:instrText>
+          <w:instrText xml:space="preserve"> PAGEREF _Toc243474524 \h </w:instrText>
         </w:r>
         <w:r>
           <w:rPr>
@@ -5231,7 +5231,7 @@
           <w14:ligatures w14:val="standardContextual"/>
         </w:rPr>
       </w:pPr>
-      <w:hyperlink w:anchor="_Toc243458931" w:history="1">
+      <w:hyperlink w:anchor="_Toc243474525" w:history="1">
         <w:r>
           <w:rPr>
             <w:rStyle w:val="Hipervnculo"/>
@@ -5258,7 +5258,7 @@
             <w:noProof/>
             <w:webHidden/>
           </w:rPr>
-          <w:instrText xml:space="preserve"> PAGEREF _Toc243458931 \h </w:instrText>
+          <w:instrText xml:space="preserve"> PAGEREF _Toc243474525 \h </w:instrText>
         </w:r>
         <w:r>
           <w:rPr>
@@ -5306,7 +5306,7 @@
           <w14:ligatures w14:val="standardContextual"/>
         </w:rPr>
       </w:pPr>
-      <w:hyperlink w:anchor="_Toc243458932" w:history="1">
+      <w:hyperlink w:anchor="_Toc243474526" w:history="1">
         <w:r>
           <w:rPr>
             <w:rStyle w:val="Hipervnculo"/>
@@ -5341,7 +5341,7 @@
             <w:noProof/>
             <w:webHidden/>
           </w:rPr>
-          <w:instrText xml:space="preserve"> PAGEREF _Toc243458932 \h </w:instrText>
+          <w:instrText xml:space="preserve"> PAGEREF _Toc243474526 \h </w:instrText>
         </w:r>
         <w:r>
           <w:rPr>
@@ -5389,7 +5389,7 @@
           <w14:ligatures w14:val="standardContextual"/>
         </w:rPr>
       </w:pPr>
-      <w:hyperlink w:anchor="_Toc243458933" w:history="1">
+      <w:hyperlink w:anchor="_Toc243474527" w:history="1">
         <w:r>
           <w:rPr>
             <w:rStyle w:val="Hipervnculo"/>
@@ -5416,7 +5416,7 @@
             <w:noProof/>
             <w:webHidden/>
           </w:rPr>
-          <w:instrText xml:space="preserve"> PAGEREF _Toc243458933 \h </w:instrText>
+          <w:instrText xml:space="preserve"> PAGEREF _Toc243474527 \h </w:instrText>
         </w:r>
         <w:r>
           <w:rPr>
@@ -5464,7 +5464,7 @@
           <w14:ligatures w14:val="standardContextual"/>
         </w:rPr>
       </w:pPr>
-      <w:hyperlink w:anchor="_Toc243458934" w:history="1">
+      <w:hyperlink w:anchor="_Toc243474528" w:history="1">
         <w:r>
           <w:rPr>
             <w:rStyle w:val="Hipervnculo"/>
@@ -5491,7 +5491,7 @@
             <w:noProof/>
             <w:webHidden/>
           </w:rPr>
-          <w:instrText xml:space="preserve"> PAGEREF _Toc243458934 \h </w:instrText>
+          <w:instrText xml:space="preserve"> PAGEREF _Toc243474528 \h </w:instrText>
         </w:r>
         <w:r>
           <w:rPr>
@@ -5539,7 +5539,7 @@
           <w14:ligatures w14:val="standardContextual"/>
         </w:rPr>
       </w:pPr>
-      <w:hyperlink w:anchor="_Toc243458935" w:history="1">
+      <w:hyperlink w:anchor="_Toc243474529" w:history="1">
         <w:r>
           <w:rPr>
             <w:rStyle w:val="Hipervnculo"/>
@@ -5566,7 +5566,7 @@
             <w:noProof/>
             <w:webHidden/>
           </w:rPr>
-          <w:instrText xml:space="preserve"> PAGEREF _Toc243458935 \h </w:instrText>
+          <w:instrText xml:space="preserve"> PAGEREF _Toc243474529 \h </w:instrText>
         </w:r>
         <w:r>
           <w:rPr>
@@ -5614,7 +5614,7 @@
           <w14:ligatures w14:val="standardContextual"/>
         </w:rPr>
       </w:pPr>
-      <w:hyperlink w:anchor="_Toc243458936" w:history="1">
+      <w:hyperlink w:anchor="_Toc243474530" w:history="1">
         <w:r>
           <w:rPr>
             <w:rStyle w:val="Hipervnculo"/>
@@ -5641,7 +5641,7 @@
             <w:noProof/>
             <w:webHidden/>
           </w:rPr>
-          <w:instrText xml:space="preserve"> PAGEREF _Toc243458936 \h </w:instrText>
+          <w:instrText xml:space="preserve"> PAGEREF _Toc243474530 \h </w:instrText>
         </w:r>
         <w:r>
           <w:rPr>
@@ -5689,7 +5689,7 @@
           <w14:ligatures w14:val="standardContextual"/>
         </w:rPr>
       </w:pPr>
-      <w:hyperlink w:anchor="_Toc243458937" w:history="1">
+      <w:hyperlink w:anchor="_Toc243474531" w:history="1">
         <w:r>
           <w:rPr>
             <w:rStyle w:val="Hipervnculo"/>
@@ -5716,7 +5716,7 @@
             <w:noProof/>
             <w:webHidden/>
           </w:rPr>
-          <w:instrText xml:space="preserve"> PAGEREF _Toc243458937 \h </w:instrText>
+          <w:instrText xml:space="preserve"> PAGEREF _Toc243474531 \h </w:instrText>
         </w:r>
         <w:r>
           <w:rPr>
@@ -5764,7 +5764,7 @@
           <w14:ligatures w14:val="standardContextual"/>
         </w:rPr>
       </w:pPr>
-      <w:hyperlink w:anchor="_Toc243458938" w:history="1">
+      <w:hyperlink w:anchor="_Toc243474532" w:history="1">
         <w:r>
           <w:rPr>
             <w:rStyle w:val="Hipervnculo"/>
@@ -5791,7 +5791,7 @@
             <w:noProof/>
             <w:webHidden/>
           </w:rPr>
-          <w:instrText xml:space="preserve"> PAGEREF _Toc243458938 \h </w:instrText>
+          <w:instrText xml:space="preserve"> PAGEREF _Toc243474532 \h </w:instrText>
         </w:r>
         <w:r>
           <w:rPr>
@@ -5839,7 +5839,7 @@
           <w14:ligatures w14:val="standardContextual"/>
         </w:rPr>
       </w:pPr>
-      <w:hyperlink w:anchor="_Toc243458939" w:history="1">
+      <w:hyperlink w:anchor="_Toc243474533" w:history="1">
         <w:r>
           <w:rPr>
             <w:rStyle w:val="Hipervnculo"/>
@@ -5866,7 +5866,7 @@
             <w:noProof/>
             <w:webHidden/>
           </w:rPr>
-          <w:instrText xml:space="preserve"> PAGEREF _Toc243458939 \h </w:instrText>
+          <w:instrText xml:space="preserve"> PAGEREF _Toc243474533 \h </w:instrText>
         </w:r>
         <w:r>
           <w:rPr>
@@ -5914,7 +5914,7 @@
           <w14:ligatures w14:val="standardContextual"/>
         </w:rPr>
       </w:pPr>
-      <w:hyperlink w:anchor="_Toc243458940" w:history="1">
+      <w:hyperlink w:anchor="_Toc243474534" w:history="1">
         <w:r>
           <w:rPr>
             <w:rStyle w:val="Hipervnculo"/>
@@ -5941,7 +5941,7 @@
             <w:noProof/>
             <w:webHidden/>
           </w:rPr>
-          <w:instrText xml:space="preserve"> PAGEREF _Toc243458940 \h </w:instrText>
+          <w:instrText xml:space="preserve"> PAGEREF _Toc243474534 \h </w:instrText>
         </w:r>
         <w:r>
           <w:rPr>
@@ -5989,7 +5989,7 @@
           <w14:ligatures w14:val="standardContextual"/>
         </w:rPr>
       </w:pPr>
-      <w:hyperlink w:anchor="_Toc243458941" w:history="1">
+      <w:hyperlink w:anchor="_Toc243474535" w:history="1">
         <w:r>
           <w:rPr>
             <w:rStyle w:val="Hipervnculo"/>
@@ -6016,7 +6016,7 @@
             <w:noProof/>
             <w:webHidden/>
           </w:rPr>
-          <w:instrText xml:space="preserve"> PAGEREF _Toc243458941 \h </w:instrText>
+          <w:instrText xml:space="preserve"> PAGEREF _Toc243474535 \h </w:instrText>
         </w:r>
         <w:r>
           <w:rPr>
@@ -6064,7 +6064,7 @@
           <w14:ligatures w14:val="standardContextual"/>
         </w:rPr>
       </w:pPr>
-      <w:hyperlink w:anchor="_Toc243458942" w:history="1">
+      <w:hyperlink w:anchor="_Toc243474536" w:history="1">
         <w:r>
           <w:rPr>
             <w:rStyle w:val="Hipervnculo"/>
@@ -6091,7 +6091,7 @@
             <w:noProof/>
             <w:webHidden/>
           </w:rPr>
-          <w:instrText xml:space="preserve"> PAGEREF _Toc243458942 \h </w:instrText>
+          <w:instrText xml:space="preserve"> PAGEREF _Toc243474536 \h </w:instrText>
         </w:r>
         <w:r>
           <w:rPr>
@@ -6139,7 +6139,7 @@
           <w14:ligatures w14:val="standardContextual"/>
         </w:rPr>
       </w:pPr>
-      <w:hyperlink w:anchor="_Toc243458943" w:history="1">
+      <w:hyperlink w:anchor="_Toc243474537" w:history="1">
         <w:r>
           <w:rPr>
             <w:rStyle w:val="Hipervnculo"/>
@@ -6166,7 +6166,7 @@
             <w:noProof/>
             <w:webHidden/>
           </w:rPr>
-          <w:instrText xml:space="preserve"> PAGEREF _Toc243458943 \h </w:instrText>
+          <w:instrText xml:space="preserve"> PAGEREF _Toc243474537 \h </w:instrText>
         </w:r>
         <w:r>
           <w:rPr>
@@ -6214,7 +6214,7 @@
           <w14:ligatures w14:val="standardContextual"/>
         </w:rPr>
       </w:pPr>
-      <w:hyperlink w:anchor="_Toc243458944" w:history="1">
+      <w:hyperlink w:anchor="_Toc243474538" w:history="1">
         <w:r>
           <w:rPr>
             <w:rStyle w:val="Hipervnculo"/>
@@ -6241,7 +6241,7 @@
             <w:noProof/>
             <w:webHidden/>
           </w:rPr>
-          <w:instrText xml:space="preserve"> PAGEREF _Toc243458944 \h </w:instrText>
+          <w:instrText xml:space="preserve"> PAGEREF _Toc243474538 \h </w:instrText>
         </w:r>
         <w:r>
           <w:rPr>
@@ -6289,7 +6289,7 @@
           <w14:ligatures w14:val="standardContextual"/>
         </w:rPr>
       </w:pPr>
-      <w:hyperlink w:anchor="_Toc243458945" w:history="1">
+      <w:hyperlink w:anchor="_Toc243474539" w:history="1">
         <w:r>
           <w:rPr>
             <w:rStyle w:val="Hipervnculo"/>
@@ -6316,7 +6316,7 @@
             <w:noProof/>
             <w:webHidden/>
           </w:rPr>
-          <w:instrText xml:space="preserve"> PAGEREF _Toc243458945 \h </w:instrText>
+          <w:instrText xml:space="preserve"> PAGEREF _Toc243474539 \h </w:instrText>
         </w:r>
         <w:r>
           <w:rPr>
@@ -6364,7 +6364,7 @@
           <w14:ligatures w14:val="standardContextual"/>
         </w:rPr>
       </w:pPr>
-      <w:hyperlink w:anchor="_Toc243458946" w:history="1">
+      <w:hyperlink w:anchor="_Toc243474540" w:history="1">
         <w:r>
           <w:rPr>
             <w:rStyle w:val="Hipervnculo"/>
@@ -6391,7 +6391,7 @@
             <w:noProof/>
             <w:webHidden/>
           </w:rPr>
-          <w:instrText xml:space="preserve"> PAGEREF _Toc243458946 \h </w:instrText>
+          <w:instrText xml:space="preserve"> PAGEREF _Toc243474540 \h </w:instrText>
         </w:r>
         <w:r>
           <w:rPr>
@@ -6439,7 +6439,7 @@
           <w14:ligatures w14:val="standardContextual"/>
         </w:rPr>
       </w:pPr>
-      <w:hyperlink w:anchor="_Toc243458947" w:history="1">
+      <w:hyperlink w:anchor="_Toc243474541" w:history="1">
         <w:r>
           <w:rPr>
             <w:rStyle w:val="Hipervnculo"/>
@@ -6466,7 +6466,7 @@
             <w:noProof/>
             <w:webHidden/>
           </w:rPr>
-          <w:instrText xml:space="preserve"> PAGEREF _Toc243458947 \h </w:instrText>
+          <w:instrText xml:space="preserve"> PAGEREF _Toc243474541 \h </w:instrText>
         </w:r>
         <w:r>
           <w:rPr>
@@ -6514,7 +6514,7 @@
           <w14:ligatures w14:val="standardContextual"/>
         </w:rPr>
       </w:pPr>
-      <w:hyperlink w:anchor="_Toc243458948" w:history="1">
+      <w:hyperlink w:anchor="_Toc243474542" w:history="1">
         <w:r>
           <w:rPr>
             <w:rStyle w:val="Hipervnculo"/>
@@ -6541,7 +6541,7 @@
             <w:noProof/>
             <w:webHidden/>
           </w:rPr>
-          <w:instrText xml:space="preserve"> PAGEREF _Toc243458948 \h </w:instrText>
+          <w:instrText xml:space="preserve"> PAGEREF _Toc243474542 \h </w:instrText>
         </w:r>
         <w:r>
           <w:rPr>
@@ -6582,9 +6582,8 @@
         <w:pStyle w:val="Ttulo1"/>
         <w:pageBreakBefore/>
       </w:pPr>
-      <w:bookmarkStart w:id="0" w:name="_Toc243458904"/>
-      <w:r>
-        <w:lastRenderedPageBreak/>
+      <w:bookmarkStart w:id="0" w:name="_Toc243474498"/>
+      <w:r>
         <w:t>ESPECIFICACIÓN DE CASOS DE USO</w:t>
       </w:r>
       <w:bookmarkEnd w:id="0"/>
@@ -6593,7 +6592,7 @@
       <w:pPr>
         <w:pStyle w:val="Ttulo2"/>
       </w:pPr>
-      <w:bookmarkStart w:id="1" w:name="_Toc243458905"/>
+      <w:bookmarkStart w:id="1" w:name="_Toc243474499"/>
       <w:r>
         <w:t>Alcance y criterios de consistencia</w:t>
       </w:r>
@@ -6665,7 +6664,7 @@
           <w:sz w:val="24"/>
         </w:rPr>
       </w:pPr>
-      <w:bookmarkStart w:id="2" w:name="_Toc243458929"/>
+      <w:bookmarkStart w:id="2" w:name="_Toc243474523"/>
       <w:r>
         <w:rPr>
           <w:sz w:val="24"/>
@@ -6789,9 +6788,8 @@
       <w:pPr>
         <w:pStyle w:val="Ttulo2"/>
       </w:pPr>
-      <w:bookmarkStart w:id="3" w:name="_Toc243458906"/>
-      <w:r>
-        <w:lastRenderedPageBreak/>
+      <w:bookmarkStart w:id="3" w:name="_Toc243474500"/>
+      <w:r>
         <w:t>Ampliación de seguridad al diagrama base</w:t>
       </w:r>
       <w:bookmarkEnd w:id="3"/>
@@ -6816,7 +6814,7 @@
       <w:pPr>
         <w:pStyle w:val="Ttulo2"/>
       </w:pPr>
-      <w:bookmarkStart w:id="4" w:name="_Toc243458907"/>
+      <w:bookmarkStart w:id="4" w:name="_Toc243474501"/>
       <w:r>
         <w:t>Convenciones para las relaciones UML</w:t>
       </w:r>
@@ -7121,7 +7119,7 @@
       <w:pPr>
         <w:pStyle w:val="Ttulo1"/>
       </w:pPr>
-      <w:bookmarkStart w:id="5" w:name="_Toc243458908"/>
+      <w:bookmarkStart w:id="5" w:name="_Toc243474502"/>
       <w:r>
         <w:t>INVENTARIO Y TRAZABILIDAD DE CASOS DE USO</w:t>
       </w:r>
@@ -7134,7 +7132,7 @@
           <w:sz w:val="24"/>
         </w:rPr>
       </w:pPr>
-      <w:bookmarkStart w:id="6" w:name="_Toc243458930"/>
+      <w:bookmarkStart w:id="6" w:name="_Toc243474524"/>
       <w:r>
         <w:rPr>
           <w:sz w:val="24"/>
@@ -8562,9 +8560,8 @@
         <w:pStyle w:val="Ttulo1"/>
         <w:pageBreakBefore/>
       </w:pPr>
-      <w:bookmarkStart w:id="7" w:name="_Toc243458909"/>
-      <w:r>
-        <w:lastRenderedPageBreak/>
+      <w:bookmarkStart w:id="7" w:name="_Toc243474503"/>
+      <w:r>
         <w:t>ECUD_AUTENTICARSE_EN_EL_SISTEMA</w:t>
       </w:r>
       <w:bookmarkEnd w:id="7"/>
@@ -8598,7 +8595,7 @@
           <w:sz w:val="24"/>
         </w:rPr>
       </w:pPr>
-      <w:bookmarkStart w:id="8" w:name="_Toc243458931"/>
+      <w:bookmarkStart w:id="8" w:name="_Toc243474525"/>
       <w:r>
         <w:rPr>
           <w:sz w:val="24"/>
@@ -9863,7 +9860,6 @@
           <w:sz w:val="24"/>
           <w:szCs w:val="24"/>
         </w:rPr>
-        <w:lastRenderedPageBreak/>
         <w:t xml:space="preserve">Casos de uso incluidos:  </w:t>
       </w:r>
       <w:r>
@@ -9937,9 +9933,8 @@
         <w:pStyle w:val="Ttulo1"/>
         <w:pageBreakBefore/>
       </w:pPr>
-      <w:bookmarkStart w:id="9" w:name="_Toc243458910"/>
-      <w:r>
-        <w:lastRenderedPageBreak/>
+      <w:bookmarkStart w:id="9" w:name="_Toc243474504"/>
+      <w:r>
         <w:t>ECUD_VALIDAR_CREDENCIALES</w:t>
       </w:r>
       <w:bookmarkEnd w:id="9"/>
@@ -9973,7 +9968,7 @@
           <w:sz w:val="24"/>
         </w:rPr>
       </w:pPr>
-      <w:bookmarkStart w:id="10" w:name="_Toc243458932"/>
+      <w:bookmarkStart w:id="10" w:name="_Toc243474526"/>
       <w:r>
         <w:rPr>
           <w:sz w:val="24"/>
@@ -11279,9 +11274,8 @@
         <w:pStyle w:val="Ttulo1"/>
         <w:pageBreakBefore/>
       </w:pPr>
-      <w:bookmarkStart w:id="11" w:name="_Toc243458911"/>
-      <w:r>
-        <w:lastRenderedPageBreak/>
+      <w:bookmarkStart w:id="11" w:name="_Toc243474505"/>
+      <w:r>
         <w:t>ECUD_GENERAR_Y_ENTREGAR_TOKEN_DE_SEGURIDAD</w:t>
       </w:r>
       <w:bookmarkEnd w:id="11"/>
@@ -11315,7 +11309,7 @@
           <w:sz w:val="24"/>
         </w:rPr>
       </w:pPr>
-      <w:bookmarkStart w:id="12" w:name="_Toc243458933"/>
+      <w:bookmarkStart w:id="12" w:name="_Toc243474527"/>
       <w:r>
         <w:rPr>
           <w:sz w:val="24"/>
@@ -12621,7 +12615,7 @@
         <w:pStyle w:val="Ttulo1"/>
         <w:pageBreakBefore/>
       </w:pPr>
-      <w:bookmarkStart w:id="13" w:name="_Toc243458912"/>
+      <w:bookmarkStart w:id="13" w:name="_Toc243474506"/>
       <w:r>
         <w:t>ECUD_CONSULTAR_CATÁLOGOS</w:t>
       </w:r>
@@ -12659,7 +12653,7 @@
           <w:sz w:val="24"/>
         </w:rPr>
       </w:pPr>
-      <w:bookmarkStart w:id="14" w:name="_Toc243458934"/>
+      <w:bookmarkStart w:id="14" w:name="_Toc243474528"/>
       <w:r>
         <w:rPr>
           <w:sz w:val="24"/>
@@ -13965,7 +13959,7 @@
         <w:pStyle w:val="Ttulo1"/>
         <w:pageBreakBefore/>
       </w:pPr>
-      <w:bookmarkStart w:id="15" w:name="_Toc243458913"/>
+      <w:bookmarkStart w:id="15" w:name="_Toc243474507"/>
       <w:r>
         <w:t>ECUD_CONSULTAR_UNIDADES_</w:t>
       </w:r>
@@ -14003,7 +13997,7 @@
           <w:sz w:val="24"/>
         </w:rPr>
       </w:pPr>
-      <w:bookmarkStart w:id="16" w:name="_Toc243458935"/>
+      <w:bookmarkStart w:id="16" w:name="_Toc243474529"/>
       <w:r>
         <w:rPr>
           <w:sz w:val="24"/>
@@ -15323,7 +15317,7 @@
         <w:pStyle w:val="Ttulo1"/>
         <w:pageBreakBefore/>
       </w:pPr>
-      <w:bookmarkStart w:id="17" w:name="_Toc243458914"/>
+      <w:bookmarkStart w:id="17" w:name="_Toc243474508"/>
       <w:r>
         <w:t>ECUD_GENERAR_RESPUESTA_ESTRUCTURADA</w:t>
       </w:r>
@@ -15358,7 +15352,7 @@
           <w:sz w:val="24"/>
         </w:rPr>
       </w:pPr>
-      <w:bookmarkStart w:id="18" w:name="_Toc243458936"/>
+      <w:bookmarkStart w:id="18" w:name="_Toc243474530"/>
       <w:r>
         <w:rPr>
           <w:sz w:val="24"/>
@@ -16664,7 +16658,7 @@
         <w:pStyle w:val="Ttulo1"/>
         <w:pageBreakBefore/>
       </w:pPr>
-      <w:bookmarkStart w:id="19" w:name="_Toc243458915"/>
+      <w:bookmarkStart w:id="19" w:name="_Toc243474509"/>
       <w:r>
         <w:t>ECUD_REALIZAR_</w:t>
       </w:r>
@@ -16705,7 +16699,7 @@
           <w:sz w:val="24"/>
         </w:rPr>
       </w:pPr>
-      <w:bookmarkStart w:id="20" w:name="_Toc243458937"/>
+      <w:bookmarkStart w:id="20" w:name="_Toc243474531"/>
       <w:r>
         <w:rPr>
           <w:sz w:val="24"/>
@@ -18138,7 +18132,7 @@
         <w:pStyle w:val="Ttulo1"/>
         <w:pageBreakBefore/>
       </w:pPr>
-      <w:bookmarkStart w:id="21" w:name="_Toc243458916"/>
+      <w:bookmarkStart w:id="21" w:name="_Toc243474510"/>
       <w:r>
         <w:t>ECUD_VALIDAR_TOKEN_DE_SEGURIDAD</w:t>
       </w:r>
@@ -18173,7 +18167,7 @@
           <w:sz w:val="24"/>
         </w:rPr>
       </w:pPr>
-      <w:bookmarkStart w:id="22" w:name="_Toc243458938"/>
+      <w:bookmarkStart w:id="22" w:name="_Toc243474532"/>
       <w:r>
         <w:rPr>
           <w:sz w:val="24"/>
@@ -19504,7 +19498,7 @@
         <w:pStyle w:val="Ttulo1"/>
         <w:pageBreakBefore/>
       </w:pPr>
-      <w:bookmarkStart w:id="23" w:name="_Toc243458917"/>
+      <w:bookmarkStart w:id="23" w:name="_Toc243474511"/>
       <w:r>
         <w:t>ECUD_VALIDAR_DATOS_DE_</w:t>
       </w:r>
@@ -19542,7 +19536,7 @@
           <w:sz w:val="24"/>
         </w:rPr>
       </w:pPr>
-      <w:bookmarkStart w:id="24" w:name="_Toc243458939"/>
+      <w:bookmarkStart w:id="24" w:name="_Toc243474533"/>
       <w:r>
         <w:rPr>
           <w:sz w:val="24"/>
@@ -20873,7 +20867,7 @@
         <w:pStyle w:val="Ttulo1"/>
         <w:pageBreakBefore/>
       </w:pPr>
-      <w:bookmarkStart w:id="25" w:name="_Toc243458918"/>
+      <w:bookmarkStart w:id="25" w:name="_Toc243474512"/>
       <w:r>
         <w:t>ECUD_CONVERTIR_LONGITUD</w:t>
       </w:r>
@@ -20908,7 +20902,7 @@
           <w:sz w:val="24"/>
         </w:rPr>
       </w:pPr>
-      <w:bookmarkStart w:id="26" w:name="_Toc243458940"/>
+      <w:bookmarkStart w:id="26" w:name="_Toc243474534"/>
       <w:r>
         <w:rPr>
           <w:sz w:val="24"/>
@@ -22267,7 +22261,7 @@
         <w:pStyle w:val="Ttulo1"/>
         <w:pageBreakBefore/>
       </w:pPr>
-      <w:bookmarkStart w:id="27" w:name="_Toc243458919"/>
+      <w:bookmarkStart w:id="27" w:name="_Toc243474513"/>
       <w:r>
         <w:t>ECUD_CONVERTIR_MASA</w:t>
       </w:r>
@@ -22302,7 +22296,7 @@
           <w:sz w:val="24"/>
         </w:rPr>
       </w:pPr>
-      <w:bookmarkStart w:id="28" w:name="_Toc243458941"/>
+      <w:bookmarkStart w:id="28" w:name="_Toc243474535"/>
       <w:r>
         <w:rPr>
           <w:sz w:val="24"/>
@@ -23661,7 +23655,7 @@
         <w:pStyle w:val="Ttulo1"/>
         <w:pageBreakBefore/>
       </w:pPr>
-      <w:bookmarkStart w:id="29" w:name="_Toc243458920"/>
+      <w:bookmarkStart w:id="29" w:name="_Toc243474514"/>
       <w:r>
         <w:t>ECUD_CONVERTIR_TEMPERATURA</w:t>
       </w:r>
@@ -23696,7 +23690,7 @@
           <w:sz w:val="24"/>
         </w:rPr>
       </w:pPr>
-      <w:bookmarkStart w:id="30" w:name="_Toc243458942"/>
+      <w:bookmarkStart w:id="30" w:name="_Toc243474536"/>
       <w:r>
         <w:rPr>
           <w:sz w:val="24"/>
@@ -25048,7 +25042,7 @@
         <w:pStyle w:val="Ttulo1"/>
         <w:pageBreakBefore/>
       </w:pPr>
-      <w:bookmarkStart w:id="31" w:name="_Toc243458921"/>
+      <w:bookmarkStart w:id="31" w:name="_Toc243474515"/>
       <w:r>
         <w:t>ECUD_GESTIONAR_ERROR_DE_</w:t>
       </w:r>
@@ -25086,7 +25080,7 @@
           <w:sz w:val="24"/>
         </w:rPr>
       </w:pPr>
-      <w:bookmarkStart w:id="32" w:name="_Toc243458943"/>
+      <w:bookmarkStart w:id="32" w:name="_Toc243474537"/>
       <w:r>
         <w:rPr>
           <w:sz w:val="24"/>
@@ -26392,7 +26386,7 @@
         <w:pStyle w:val="Ttulo1"/>
         <w:pageBreakBefore/>
       </w:pPr>
-      <w:bookmarkStart w:id="33" w:name="_Toc243458922"/>
+      <w:bookmarkStart w:id="33" w:name="_Toc243474516"/>
       <w:r>
         <w:t>ECUD_UNIDAD_NO_SOPORTADA</w:t>
       </w:r>
@@ -26427,7 +26421,7 @@
           <w:sz w:val="24"/>
         </w:rPr>
       </w:pPr>
-      <w:bookmarkStart w:id="34" w:name="_Toc243458944"/>
+      <w:bookmarkStart w:id="34" w:name="_Toc243474538"/>
       <w:r>
         <w:rPr>
           <w:sz w:val="24"/>
@@ -27673,7 +27667,7 @@
           <w:sz w:val="24"/>
           <w:szCs w:val="24"/>
         </w:rPr>
-        <w:t>Categoría consultable pero sin conversión implementada: rechazar esa conversión.</w:t>
+        <w:t>Categoría inexistente o vacía: devolver ERROR/DATA-001 sin realizar la conversión.</w:t>
       </w:r>
     </w:p>
     <w:p>
@@ -27758,7 +27752,7 @@
         <w:pStyle w:val="Ttulo1"/>
         <w:pageBreakBefore/>
       </w:pPr>
-      <w:bookmarkStart w:id="35" w:name="_Toc243458923"/>
+      <w:bookmarkStart w:id="35" w:name="_Toc243474517"/>
       <w:r>
         <w:t>ECUD_DATOS_INCONSISTENTES</w:t>
       </w:r>
@@ -27793,7 +27787,7 @@
           <w:sz w:val="24"/>
         </w:rPr>
       </w:pPr>
-      <w:bookmarkStart w:id="36" w:name="_Toc243458945"/>
+      <w:bookmarkStart w:id="36" w:name="_Toc243474539"/>
       <w:r>
         <w:rPr>
           <w:sz w:val="24"/>
@@ -29124,7 +29118,7 @@
         <w:pStyle w:val="Ttulo1"/>
         <w:pageBreakBefore/>
       </w:pPr>
-      <w:bookmarkStart w:id="37" w:name="_Toc243458924"/>
+      <w:bookmarkStart w:id="37" w:name="_Toc243474518"/>
       <w:r>
         <w:t>ECUD_GESTIONAR_ERROR_DE_</w:t>
       </w:r>
@@ -29162,7 +29156,7 @@
           <w:sz w:val="24"/>
         </w:rPr>
       </w:pPr>
-      <w:bookmarkStart w:id="38" w:name="_Toc243458946"/>
+      <w:bookmarkStart w:id="38" w:name="_Toc243474540"/>
       <w:r>
         <w:rPr>
           <w:sz w:val="24"/>
@@ -30507,7 +30501,7 @@
         <w:pStyle w:val="Ttulo1"/>
         <w:pageBreakBefore/>
       </w:pPr>
-      <w:bookmarkStart w:id="39" w:name="_Toc243458925"/>
+      <w:bookmarkStart w:id="39" w:name="_Toc243474519"/>
       <w:r>
         <w:t>ECUD_GESTIONAR_</w:t>
       </w:r>
@@ -30548,7 +30542,7 @@
           <w:sz w:val="24"/>
         </w:rPr>
       </w:pPr>
-      <w:bookmarkStart w:id="40" w:name="_Toc243458947"/>
+      <w:bookmarkStart w:id="40" w:name="_Toc243474541"/>
       <w:r>
         <w:rPr>
           <w:sz w:val="24"/>
@@ -31900,7 +31894,7 @@
         <w:pStyle w:val="Ttulo1"/>
         <w:pageBreakBefore/>
       </w:pPr>
-      <w:bookmarkStart w:id="41" w:name="_Toc243458926"/>
+      <w:bookmarkStart w:id="41" w:name="_Toc243474520"/>
       <w:r>
         <w:t>COBERTURA DE ERRORES Y TRAZABILIDAD DEL ERS</w:t>
       </w:r>
@@ -31928,7 +31922,7 @@
           <w:sz w:val="24"/>
         </w:rPr>
       </w:pPr>
-      <w:bookmarkStart w:id="42" w:name="_Toc243458948"/>
+      <w:bookmarkStart w:id="42" w:name="_Toc243474542"/>
       <w:r>
         <w:rPr>
           <w:sz w:val="24"/>
@@ -32384,7 +32378,7 @@
       <w:pPr>
         <w:pStyle w:val="Ttulo2"/>
       </w:pPr>
-      <w:bookmarkStart w:id="43" w:name="_Toc243458927"/>
+      <w:bookmarkStart w:id="43" w:name="_Toc243474521"/>
       <w:r>
         <w:t>Contrato de respuesta y protocolo</w:t>
       </w:r>
@@ -32446,7 +32440,7 @@
       <w:pPr>
         <w:pStyle w:val="Ttulo2"/>
       </w:pPr>
-      <w:bookmarkStart w:id="44" w:name="_Toc243458928"/>
+      <w:bookmarkStart w:id="44" w:name="_Toc243474522"/>
       <w:r>
         <w:t>Relación con la Especificación de Requisitos de Software</w:t>
       </w:r>

</xml_diff>